<commit_message>
Day 8: 补充 - demo_oop参考 + 简历模板
</commit_message>
<xml_diff>
--- a/docs/简历模板.docx
+++ b/docs/简历模板.docx
@@ -243,7 +243,7 @@
         <w:spacing w:after="40"/>
       </w:pPr>
       <w:r>
-        <w:t>Python：掌握基础语法、面向对象、模块化开发、异常处理</w:t>
+        <w:t>Python：掌握基础语法、面向对象、模块化开发</w:t>
       </w:r>
     </w:p>
     <w:p>
@@ -252,7 +252,7 @@
         <w:spacing w:after="40"/>
       </w:pPr>
       <w:r>
-        <w:t>后端框架：FastAPI（RESTful API、Swagger 文档、APIRouter）</w:t>
+        <w:t>后端框架：FastAPI（RESTful API、Swagger 文档）</w:t>
       </w:r>
     </w:p>
     <w:p>
@@ -261,7 +261,7 @@
         <w:spacing w:after="40"/>
       </w:pPr>
       <w:r>
-        <w:t>数据库：MySQL、SQLAlchemy ORM、JWT 认证、密码加密</w:t>
+        <w:t>数据库：MySQL、SQLAlchemy ORM、JWT 认证</w:t>
       </w:r>
     </w:p>
     <w:p>
@@ -270,7 +270,7 @@
         <w:spacing w:after="40"/>
       </w:pPr>
       <w:r>
-        <w:t>AI 大模型：Ollama 本地部署、DeepSeek API 调用、Prompt 工程</w:t>
+        <w:t>AI 大模型：Ollama 部署、DeepSeek API、Prompt 工程</w:t>
       </w:r>
     </w:p>
     <w:p>
@@ -297,7 +297,7 @@
         <w:spacing w:after="40"/>
       </w:pPr>
       <w:r>
-        <w:t>工程工具：Git、Docker、docker-compose</w:t>
+        <w:t>数据可视化：mplfinance、Plotly（K 线图、技术指标）</w:t>
       </w:r>
     </w:p>
     <w:p>
@@ -306,7 +306,16 @@
         <w:spacing w:after="40"/>
       </w:pPr>
       <w:r>
-        <w:t>前端：Streamlit、pywebview 桌面应用打包</w:t>
+        <w:t>容器化部署：Docker、docker-compose（三个项目均可一键部署）</w:t>
+      </w:r>
+    </w:p>
+    <w:p>
+      <w:pPr>
+        <w:pStyle w:val="ListBullet"/>
+        <w:spacing w:after="40"/>
+      </w:pPr>
+      <w:r>
+        <w:t>桌面端：Streamlit + pywebview</w:t>
       </w:r>
     </w:p>
     <w:p>
@@ -323,26 +332,20 @@
           <w:b/>
           <w:sz w:val="24"/>
         </w:rPr>
-        <w:t>1. OpenAgent Studio（AI Agent 桌面平台）</w:t>
+        <w:t>1. AI 股票分析助手（主攻项目）</w:t>
       </w:r>
     </w:p>
     <w:p>
-      <w:pPr/>
       <w:r>
         <w:rPr>
           <w:i/>
         </w:rPr>
-        <w:t>技术栈：Python + FastAPI + LangGraph + RAG + Docker</w:t>
-      </w:r>
-      <w:r>
-        <w:rPr>
-          <w:i/>
-        </w:rPr>
+        <w:t>技术栈：Python + FastAPI + LangGraph + RAG + akshare + Docker</w:t>
       </w:r>
     </w:p>
     <w:p>
       <w:r>
-        <w:t>一款集成了 AI 对话、知识库问答、Agent 自动化工作流的桌面应用。用户上传文档后，AI 能基于文档内容回答问题；Agent 工作台可自动搜索、分析并输出报告。支持 Docker 一键部署。</w:t>
+        <w:t>一款集成 AI 分析的桌面级股票工具。支持自选股管理、K 线图与技术指标、AI 新闻舆情分析、财报 PDF 解析（RAG）、AI 综合评分与买卖建议、投资组合管理。内置 Agent 自动生成每日早报和复盘报告。docker-compose up 一条命令即可运行。</w:t>
       </w:r>
     </w:p>
     <w:p>
@@ -351,7 +354,7 @@
           <w:b/>
           <w:sz w:val="24"/>
         </w:rPr>
-        <w:t>2. AI Interview Assistant（AI 模拟面试助手）</w:t>
+        <w:t>2. AI 个人知识工作台</w:t>
       </w:r>
     </w:p>
     <w:p>
@@ -359,12 +362,12 @@
         <w:rPr>
           <w:i/>
         </w:rPr>
-        <w:t>技术栈：Python + FastAPI + RAG + Streamlit</w:t>
+        <w:t>技术栈：Python + FastAPI + LangChain + RAG + Whisper + Docker</w:t>
       </w:r>
     </w:p>
     <w:p>
       <w:r>
-        <w:t>基于个人简历的 AI 模拟面试工具。上传简历后 AI 提取技能关键词，根据简历生成面试题目并模拟面试官问答，最后给出评分和改进建议。</w:t>
+        <w:t>一款个人学习与知识管理桌面应用。支持 Markdown 笔记、语音速记、AI 学习助手（上传资料提取重点）、RAG 知识库（文档检索问答）、AI 写作辅助（润色/扩写/翻译）。Docker 一键部署。</w:t>
       </w:r>
     </w:p>
     <w:p>
@@ -373,7 +376,7 @@
           <w:b/>
           <w:sz w:val="24"/>
         </w:rPr>
-        <w:t>3. AI Office Agent（AI 办公自动化工具）</w:t>
+        <w:t>3. AI 个人健康管家</w:t>
       </w:r>
     </w:p>
     <w:p>
@@ -381,12 +384,12 @@
         <w:rPr>
           <w:i/>
         </w:rPr>
-        <w:t>技术栈：Python + LangChain + MCP + Streamlit</w:t>
+        <w:t>技术栈：Python + FastAPI + RAG + PyMuPDF + Plotly + Docker</w:t>
       </w:r>
     </w:p>
     <w:p>
       <w:r>
-        <w:t>连接 AI 与办公软件的工具。上传 Excel 后 AI 自动分析数据趋势、生成统计图表并输出 Word 分析报告，实现办公流程自动化。</w:t>
+        <w:t>一款个人健康管理桌面应用。支持体检报告解析、AI 症状分析、用药提醒、饮食记录与营养分析、健康趋势图。支持 Docker 部署。</w:t>
       </w:r>
     </w:p>
     <w:p>
@@ -517,7 +520,7 @@
     </w:p>
     <w:p>
       <w:r>
-        <w:t>具备独立开发完整 AI 应用的能力，从后端接口到前端界面到部署全流程。熟悉主流 AI 技术栈（LLM / RAG / Agent / MCP）。GitHub 持续更新，代码工程规范，Commit 记录清晰。学习能力强，坚持每天投入 7+ 小时系统学习。</w:t>
+        <w:t>具备独立开发完整 AI 应用的能力，从后端接口到前端界面到部署全流程。三个项目均支持 Docker 一键部署。熟悉主流 AI 技术栈（LLM / RAG / Agent / MCP）。GitHub 持续更新，代码工程规范，Commit 记录清晰。学习能力强，坚持每天 7+ 小时系统学习。</w:t>
       </w:r>
     </w:p>
     <w:sectPr>

</xml_diff>